<commit_message>
Updated notes on the impact of LC/NC platforms
Added more of my notes that I had gone off of for my script. Added a new page that lists the sites I've used in APA formatting.
</commit_message>
<xml_diff>
--- a/Impact of LCNC Platform notes.docx
+++ b/Impact of LCNC Platform notes.docx
@@ -28,9 +28,8 @@
           <w:i/>
           <w:iCs/>
         </w:rPr>
-        <w:t xml:space="preserve">Low Code/No Code </w:t>
-      </w:r>
-      <w:proofErr w:type="gramStart"/>
+        <w:t>Low Code/No Code Platforms</w:t>
+      </w:r>
       <w:r>
         <w:rPr>
           <w:b/>
@@ -38,26 +37,7 @@
           <w:i/>
           <w:iCs/>
         </w:rPr>
-        <w:t>Platforms</w:t>
-      </w:r>
-      <w:r>
-        <w:rPr>
-          <w:b/>
-          <w:bCs/>
-          <w:i/>
-          <w:iCs/>
-        </w:rPr>
-        <w:t>(</w:t>
-      </w:r>
-      <w:proofErr w:type="gramEnd"/>
-      <w:r>
-        <w:rPr>
-          <w:b/>
-          <w:bCs/>
-          <w:i/>
-          <w:iCs/>
-        </w:rPr>
-        <w:t>LCNC) on Software Development</w:t>
+        <w:t>(LCNC) on Software Development</w:t>
       </w:r>
     </w:p>
     <w:p>
@@ -69,19 +49,10 @@
         </w:numPr>
       </w:pPr>
       <w:r>
-        <w:t>LCNC platform</w:t>
-      </w:r>
-      <w:r>
-        <w:t>s can reduce development time by50-90%</w:t>
-      </w:r>
-      <w:r>
-        <w:t xml:space="preserve">, when compared to traditional coding, thus allowing for </w:t>
-      </w:r>
-      <w:r>
-        <w:t xml:space="preserve">a product to de brought to the market </w:t>
-      </w:r>
-      <w:r>
-        <w:t>quicker than ever.</w:t>
+        <w:t>Software Development has been revol</w:t>
+      </w:r>
+      <w:r>
+        <w:t>utionized</w:t>
       </w:r>
     </w:p>
     <w:p>
@@ -93,21 +64,31 @@
         </w:numPr>
       </w:pPr>
       <w:r>
-        <w:t>Anyone</w:t>
-      </w:r>
-      <w:r>
-        <w:t xml:space="preserve"> with access to a computer nowadays </w:t>
-      </w:r>
-      <w:proofErr w:type="gramStart"/>
-      <w:r>
-        <w:t>is able to</w:t>
-      </w:r>
-      <w:proofErr w:type="gramEnd"/>
+        <w:t>LCNC platform</w:t>
+      </w:r>
+      <w:r>
+        <w:t>s can reduce development time by</w:t>
+      </w:r>
       <w:r>
         <w:t xml:space="preserve"> </w:t>
       </w:r>
       <w:r>
-        <w:t>use LCNC platforms</w:t>
+        <w:t>50-90%</w:t>
+      </w:r>
+      <w:r>
+        <w:t xml:space="preserve">, when compared to traditional coding, thus allowing for </w:t>
+      </w:r>
+      <w:r>
+        <w:t xml:space="preserve">a product to </w:t>
+      </w:r>
+      <w:r>
+        <w:t>b</w:t>
+      </w:r>
+      <w:r>
+        <w:t xml:space="preserve">e brought to the market </w:t>
+      </w:r>
+      <w:r>
+        <w:t>quicker than ever.</w:t>
       </w:r>
     </w:p>
     <w:p>
@@ -119,15 +100,84 @@
         </w:numPr>
       </w:pPr>
       <w:r>
-        <w:t xml:space="preserve">As </w:t>
-      </w:r>
-      <w:proofErr w:type="gramStart"/>
-      <w:r>
-        <w:t>more and more</w:t>
-      </w:r>
-      <w:proofErr w:type="gramEnd"/>
-      <w:r>
-        <w:t xml:space="preserve"> busine</w:t>
+        <w:t>Creation of these platforms has created a new “sector</w:t>
+      </w:r>
+      <w:r>
+        <w:t>”</w:t>
+      </w:r>
+    </w:p>
+    <w:p>
+      <w:pPr>
+        <w:pStyle w:val="ListParagraph"/>
+        <w:numPr>
+          <w:ilvl w:val="0"/>
+          <w:numId w:val="1"/>
+        </w:numPr>
+      </w:pPr>
+      <w:r>
+        <w:t>Anyone</w:t>
+      </w:r>
+      <w:r>
+        <w:t xml:space="preserve"> with access to a computer nowadays is able to </w:t>
+      </w:r>
+      <w:r>
+        <w:t>use LCNC platforms</w:t>
+      </w:r>
+    </w:p>
+    <w:p>
+      <w:pPr>
+        <w:pStyle w:val="ListParagraph"/>
+        <w:numPr>
+          <w:ilvl w:val="0"/>
+          <w:numId w:val="1"/>
+        </w:numPr>
+      </w:pPr>
+      <w:r>
+        <w:t>Made so accessible that small businesses</w:t>
+      </w:r>
+      <w:r>
+        <w:t>, interns,</w:t>
+      </w:r>
+      <w:r>
+        <w:t xml:space="preserve"> and even </w:t>
+      </w:r>
+      <w:r>
+        <w:t>beginners are able to use them</w:t>
+      </w:r>
+    </w:p>
+    <w:p>
+      <w:pPr>
+        <w:pStyle w:val="ListParagraph"/>
+        <w:numPr>
+          <w:ilvl w:val="0"/>
+          <w:numId w:val="1"/>
+        </w:numPr>
+      </w:pPr>
+      <w:r>
+        <w:t xml:space="preserve">Improve productivity by freeing up </w:t>
+      </w:r>
+      <w:proofErr w:type="spellStart"/>
+      <w:r>
+        <w:t>devs</w:t>
+      </w:r>
+      <w:proofErr w:type="spellEnd"/>
+      <w:r>
+        <w:t xml:space="preserve"> from simple</w:t>
+      </w:r>
+      <w:r>
+        <w:t xml:space="preserve"> tasks and focus on large concerns or more wide scaled projects</w:t>
+      </w:r>
+    </w:p>
+    <w:p>
+      <w:pPr>
+        <w:pStyle w:val="ListParagraph"/>
+        <w:numPr>
+          <w:ilvl w:val="0"/>
+          <w:numId w:val="1"/>
+        </w:numPr>
+      </w:pPr>
+      <w:r>
+        <w:t>As more and more busine</w:t>
       </w:r>
       <w:r>
         <w:t xml:space="preserve">sses take on LCNCs, IT departments must </w:t>
@@ -138,14 +188,122 @@
       <w:r>
         <w:t xml:space="preserve">maintain </w:t>
       </w:r>
+      <w:r>
+        <w:t>oversight</w:t>
+      </w:r>
+      <w:r>
+        <w:t>, to prevent security vulnerabilities and inefficiencies.</w:t>
+      </w:r>
+    </w:p>
+    <w:p>
+      <w:pPr>
+        <w:pStyle w:val="ListParagraph"/>
+        <w:numPr>
+          <w:ilvl w:val="0"/>
+          <w:numId w:val="1"/>
+        </w:numPr>
+      </w:pPr>
+      <w:r>
+        <w:t xml:space="preserve">Possible that </w:t>
+      </w:r>
+      <w:r>
+        <w:t>errors or mistakes can be overlooked as just about anyone can use these platforms</w:t>
+      </w:r>
+    </w:p>
+    <w:p/>
+    <w:p/>
+    <w:p/>
+    <w:p/>
+    <w:p/>
+    <w:p/>
+    <w:p/>
+    <w:p/>
+    <w:p/>
+    <w:p/>
+    <w:p/>
+    <w:p/>
+    <w:p/>
+    <w:p/>
+    <w:p>
+      <w:pPr>
+        <w:jc w:val="center"/>
+      </w:pPr>
+      <w:r>
+        <w:lastRenderedPageBreak/>
+        <w:t>Citations</w:t>
+      </w:r>
+    </w:p>
+    <w:p>
       <w:proofErr w:type="spellStart"/>
       <w:r>
-        <w:t>overight</w:t>
+        <w:t>qxrdev</w:t>
       </w:r>
       <w:proofErr w:type="spellEnd"/>
       <w:r>
-        <w:t>, to prevent security vulnerabilities and inefficiencies.</w:t>
-      </w:r>
+        <w:t>. (2024, September 3). </w:t>
+      </w:r>
+      <w:r>
+        <w:rPr>
+          <w:i/>
+          <w:iCs/>
+        </w:rPr>
+        <w:t>Rise of Low-Code/No-Code Development In Canada</w:t>
+      </w:r>
+      <w:r>
+        <w:t>. Sterling College. https://sterlingcollege.ca/the-rise-of-low-code-no-code-development-how-its-changing-the-industry/</w:t>
+      </w:r>
+    </w:p>
+    <w:p>
+      <w:r>
+        <w:rPr>
+          <w:i/>
+          <w:iCs/>
+        </w:rPr>
+        <w:t>Is Low-Code/No-Code the Future of Software Development?</w:t>
+      </w:r>
+      <w:r>
+        <w:t> (2024). Eleken.co. https://www.eleken.co/blog-posts/is-low-code-no-code-the-future-of-software-development</w:t>
+      </w:r>
+    </w:p>
+    <w:p>
+      <w:pPr>
+        <w:rPr>
+          <w:lang w:val="fr-CA"/>
+        </w:rPr>
+      </w:pPr>
+      <w:r>
+        <w:t>Joshi, H. (2024, December 27). </w:t>
+      </w:r>
+      <w:r>
+        <w:rPr>
+          <w:i/>
+          <w:iCs/>
+        </w:rPr>
+        <w:t>Council Post: The Impact Of Low-Code/No-Code Architectures On Digital Transformation</w:t>
+      </w:r>
+      <w:r>
+        <w:t xml:space="preserve">. </w:t>
+      </w:r>
+      <w:r>
+        <w:rPr>
+          <w:lang w:val="fr-CA"/>
+        </w:rPr>
+        <w:t>Forbes. https://www.forbes.com/councils/forbestechcouncil/2024/12/27/the-impact-of-low-codeno-code-architectures-on-digital-transformation/</w:t>
+      </w:r>
+    </w:p>
+    <w:p>
+      <w:pPr>
+        <w:rPr>
+          <w:lang w:val="fr-CA"/>
+        </w:rPr>
+      </w:pPr>
+    </w:p>
+    <w:p>
+      <w:pPr>
+        <w:rPr>
+          <w:lang w:val="fr-CA"/>
+        </w:rPr>
+      </w:pPr>
     </w:p>
     <w:sectPr>
       <w:pgSz w:w="12240" w:h="15840"/>
@@ -155,6 +313,56 @@
     </w:sectPr>
   </w:body>
 </w:document>
+</file>
+
+<file path=word/endnotes.xml><?xml version="1.0" encoding="utf-8"?>
+<w:endnotes xmlns:wpc="http://schemas.microsoft.com/office/word/2010/wordprocessingCanvas" xmlns:cx="http://schemas.microsoft.com/office/drawing/2014/chartex" xmlns:cx1="http://schemas.microsoft.com/office/drawing/2015/9/8/chartex" xmlns:cx2="http://schemas.microsoft.com/office/drawing/2015/10/21/chartex" xmlns:cx3="http://schemas.microsoft.com/office/drawing/2016/5/9/chartex" xmlns:cx4="http://schemas.microsoft.com/office/drawing/2016/5/10/chartex" xmlns:cx5="http://schemas.microsoft.com/office/drawing/2016/5/11/chartex" xmlns:cx6="http://schemas.microsoft.com/office/drawing/2016/5/12/chartex" xmlns:cx7="http://schemas.microsoft.com/office/drawing/2016/5/13/chartex" xmlns:cx8="http://schemas.microsoft.com/office/drawing/2016/5/14/chartex" xmlns:mc="http://schemas.openxmlformats.org/markup-compatibility/2006" xmlns:aink="http://schemas.microsoft.com/office/drawing/2016/ink" xmlns:am3d="http://schemas.microsoft.com/office/drawing/2017/model3d" xmlns:o="urn:schemas-microsoft-com:office:office" xmlns:oel="http://schemas.microsoft.com/office/2019/extlst" xmlns:r="http://schemas.openxmlformats.org/officeDocument/2006/relationships" xmlns:m="http://schemas.openxmlformats.org/officeDocument/2006/math" xmlns:v="urn:schemas-microsoft-com:vml" xmlns:wp14="http://schemas.microsoft.com/office/word/2010/wordprocessingDrawing" xmlns:wp="http://schemas.openxmlformats.org/drawingml/2006/wordprocessingDrawing" xmlns:w10="urn:schemas-microsoft-com:office:word" xmlns:w="http://schemas.openxmlformats.org/wordprocessingml/2006/main" xmlns:w14="http://schemas.microsoft.com/office/word/2010/wordml" xmlns:w15="http://schemas.microsoft.com/office/word/2012/wordml" xmlns:w16cex="http://schemas.microsoft.com/office/word/2018/wordml/cex" xmlns:w16cid="http://schemas.microsoft.com/office/word/2016/wordml/cid" xmlns:w16="http://schemas.microsoft.com/office/word/2018/wordml" xmlns:w16du="http://schemas.microsoft.com/office/word/2023/wordml/word16du" xmlns:w16sdtdh="http://schemas.microsoft.com/office/word/2020/wordml/sdtdatahash" xmlns:w16sdtfl="http://schemas.microsoft.com/office/word/2024/wordml/sdtformatlock" xmlns:w16se="http://schemas.microsoft.com/office/word/2015/wordml/symex" xmlns:wpg="http://schemas.microsoft.com/office/word/2010/wordprocessingGroup" xmlns:wpi="http://schemas.microsoft.com/office/word/2010/wordprocessingInk" xmlns:wne="http://schemas.microsoft.com/office/word/2006/wordml" xmlns:wps="http://schemas.microsoft.com/office/word/2010/wordprocessingShape" mc:Ignorable="w14 w15 w16se w16cid w16 w16cex w16sdtdh w16sdtfl w16du wp14">
+  <w:endnote w:type="separator" w:id="-1">
+    <w:p>
+      <w:pPr>
+        <w:spacing w:after="0" w:line="240" w:lineRule="auto"/>
+      </w:pPr>
+      <w:r>
+        <w:separator/>
+      </w:r>
+    </w:p>
+  </w:endnote>
+  <w:endnote w:type="continuationSeparator" w:id="0">
+    <w:p>
+      <w:pPr>
+        <w:spacing w:after="0" w:line="240" w:lineRule="auto"/>
+      </w:pPr>
+      <w:r>
+        <w:continuationSeparator/>
+      </w:r>
+    </w:p>
+  </w:endnote>
+</w:endnotes>
+</file>
+
+<file path=word/footnotes.xml><?xml version="1.0" encoding="utf-8"?>
+<w:footnotes xmlns:wpc="http://schemas.microsoft.com/office/word/2010/wordprocessingCanvas" xmlns:cx="http://schemas.microsoft.com/office/drawing/2014/chartex" xmlns:cx1="http://schemas.microsoft.com/office/drawing/2015/9/8/chartex" xmlns:cx2="http://schemas.microsoft.com/office/drawing/2015/10/21/chartex" xmlns:cx3="http://schemas.microsoft.com/office/drawing/2016/5/9/chartex" xmlns:cx4="http://schemas.microsoft.com/office/drawing/2016/5/10/chartex" xmlns:cx5="http://schemas.microsoft.com/office/drawing/2016/5/11/chartex" xmlns:cx6="http://schemas.microsoft.com/office/drawing/2016/5/12/chartex" xmlns:cx7="http://schemas.microsoft.com/office/drawing/2016/5/13/chartex" xmlns:cx8="http://schemas.microsoft.com/office/drawing/2016/5/14/chartex" xmlns:mc="http://schemas.openxmlformats.org/markup-compatibility/2006" xmlns:aink="http://schemas.microsoft.com/office/drawing/2016/ink" xmlns:am3d="http://schemas.microsoft.com/office/drawing/2017/model3d" xmlns:o="urn:schemas-microsoft-com:office:office" xmlns:oel="http://schemas.microsoft.com/office/2019/extlst" xmlns:r="http://schemas.openxmlformats.org/officeDocument/2006/relationships" xmlns:m="http://schemas.openxmlformats.org/officeDocument/2006/math" xmlns:v="urn:schemas-microsoft-com:vml" xmlns:wp14="http://schemas.microsoft.com/office/word/2010/wordprocessingDrawing" xmlns:wp="http://schemas.openxmlformats.org/drawingml/2006/wordprocessingDrawing" xmlns:w10="urn:schemas-microsoft-com:office:word" xmlns:w="http://schemas.openxmlformats.org/wordprocessingml/2006/main" xmlns:w14="http://schemas.microsoft.com/office/word/2010/wordml" xmlns:w15="http://schemas.microsoft.com/office/word/2012/wordml" xmlns:w16cex="http://schemas.microsoft.com/office/word/2018/wordml/cex" xmlns:w16cid="http://schemas.microsoft.com/office/word/2016/wordml/cid" xmlns:w16="http://schemas.microsoft.com/office/word/2018/wordml" xmlns:w16du="http://schemas.microsoft.com/office/word/2023/wordml/word16du" xmlns:w16sdtdh="http://schemas.microsoft.com/office/word/2020/wordml/sdtdatahash" xmlns:w16sdtfl="http://schemas.microsoft.com/office/word/2024/wordml/sdtformatlock" xmlns:w16se="http://schemas.microsoft.com/office/word/2015/wordml/symex" xmlns:wpg="http://schemas.microsoft.com/office/word/2010/wordprocessingGroup" xmlns:wpi="http://schemas.microsoft.com/office/word/2010/wordprocessingInk" xmlns:wne="http://schemas.microsoft.com/office/word/2006/wordml" xmlns:wps="http://schemas.microsoft.com/office/word/2010/wordprocessingShape" mc:Ignorable="w14 w15 w16se w16cid w16 w16cex w16sdtdh w16sdtfl w16du wp14">
+  <w:footnote w:type="separator" w:id="-1">
+    <w:p>
+      <w:pPr>
+        <w:spacing w:after="0" w:line="240" w:lineRule="auto"/>
+      </w:pPr>
+      <w:r>
+        <w:separator/>
+      </w:r>
+    </w:p>
+  </w:footnote>
+  <w:footnote w:type="continuationSeparator" w:id="0">
+    <w:p>
+      <w:pPr>
+        <w:spacing w:after="0" w:line="240" w:lineRule="auto"/>
+      </w:pPr>
+      <w:r>
+        <w:continuationSeparator/>
+      </w:r>
+    </w:p>
+  </w:footnote>
+</w:footnotes>
 </file>
 
 <file path=word/numbering.xml><?xml version="1.0" encoding="utf-8"?>
@@ -880,7 +1088,6 @@
   <w:style w:type="character" w:default="1" w:styleId="DefaultParagraphFont">
     <w:name w:val="Default Paragraph Font"/>
     <w:uiPriority w:val="1"/>
-    <w:semiHidden/>
     <w:unhideWhenUsed/>
   </w:style>
   <w:style w:type="table" w:default="1" w:styleId="TableNormal">
@@ -1193,6 +1400,50 @@
       <w:color w:val="0F4761" w:themeColor="accent1" w:themeShade="BF"/>
       <w:spacing w:val="5"/>
     </w:rPr>
+  </w:style>
+  <w:style w:type="paragraph" w:styleId="Header">
+    <w:name w:val="header"/>
+    <w:basedOn w:val="Normal"/>
+    <w:link w:val="HeaderChar"/>
+    <w:uiPriority w:val="99"/>
+    <w:unhideWhenUsed/>
+    <w:rsid w:val="004F2033"/>
+    <w:pPr>
+      <w:tabs>
+        <w:tab w:val="center" w:pos="4680"/>
+        <w:tab w:val="right" w:pos="9360"/>
+      </w:tabs>
+      <w:spacing w:after="0" w:line="240" w:lineRule="auto"/>
+    </w:pPr>
+  </w:style>
+  <w:style w:type="character" w:customStyle="1" w:styleId="HeaderChar">
+    <w:name w:val="Header Char"/>
+    <w:basedOn w:val="DefaultParagraphFont"/>
+    <w:link w:val="Header"/>
+    <w:uiPriority w:val="99"/>
+    <w:rsid w:val="004F2033"/>
+  </w:style>
+  <w:style w:type="paragraph" w:styleId="Footer">
+    <w:name w:val="footer"/>
+    <w:basedOn w:val="Normal"/>
+    <w:link w:val="FooterChar"/>
+    <w:uiPriority w:val="99"/>
+    <w:unhideWhenUsed/>
+    <w:rsid w:val="004F2033"/>
+    <w:pPr>
+      <w:tabs>
+        <w:tab w:val="center" w:pos="4680"/>
+        <w:tab w:val="right" w:pos="9360"/>
+      </w:tabs>
+      <w:spacing w:after="0" w:line="240" w:lineRule="auto"/>
+    </w:pPr>
+  </w:style>
+  <w:style w:type="character" w:customStyle="1" w:styleId="FooterChar">
+    <w:name w:val="Footer Char"/>
+    <w:basedOn w:val="DefaultParagraphFont"/>
+    <w:link w:val="Footer"/>
+    <w:uiPriority w:val="99"/>
+    <w:rsid w:val="004F2033"/>
   </w:style>
 </w:styles>
 </file>

</xml_diff>